<commit_message>
chore: cap nhat ket qua chay va file temp
</commit_message>
<xml_diff>
--- a/Đề tài của tôi.docx
+++ b/Đề tài của tôi.docx
@@ -1042,7 +1042,19 @@
         <w:t xml:space="preserve">. Hệ thống được đánh giá định lượng qua hai bộ kịch bản độc lập: (i) năm kịch bản động học khắt khe (tốc độ rất thấp, đảo chiều qua điểm không, tăng tốc nhanh, phanh gấp, rung động vi mô) với độ trễ ước lượng tối đa đo được là 3,49 ms; và (ii) năm kịch bản theo khung Rubric của đề tài (Nominal, Low Noise, High Noise, Parameter Drift, Hardware Fault), trong đó module tự động hiệu chuẩn pha (Calibration) đạt độ chính xác 100,00% khi phát hiện độ lệch pha do nhiệt 0,1750 rad. Phân tích Monte Carlo </w:t>
       </w:r>
       <w:r>
-        <w:t>với 100 lần lặp cho mỗi mức nhiễu được thực hiện trực tiếp trên cạnh miền xung, kết hợp jitter và bounce trước khi giải mã Quadrature X4. Kết quả cho thấy RMSE trung vị của bộ ước lượng Hybrid tăng từ 1,1377 rad/s ở mức nhiễu 0 lên 5,6107 rad/s tại mức nhiễu cao nhất 0,05 rad. Đồng thời, tại một số mức nhiễu trung gian xuất hiện các giá trị ngoại lệ lớn, thể hiện qua khoảng P05-P95 và giá trị RMSE cực đại.</w:t>
+        <w:t xml:space="preserve">với 100 lần lặp cho mỗi mức nhiễu được thực hiện trực tiếp trên cạnh miền xung, kết hợp jitter và bounce trước khi giải mã Quadrature X4. Kết quả cho thấy RMSE trung vị của bộ ước lượng Hybrid tăng từ </w:t>
+      </w:r>
+      <w:r>
+        <w:t>0,0008</w:t>
+      </w:r>
+      <w:r>
+        <w:t xml:space="preserve"> rad/s ở mức nhiễu 0 lên </w:t>
+      </w:r>
+      <w:r>
+        <w:t>0,0289</w:t>
+      </w:r>
+      <w:r>
+        <w:t xml:space="preserve"> rad/s tại mức nhiễu cao nhất 0,05 rad. Đồng thời, tại một số mức nhiễu trung gian xuất hiện các giá trị ngoại lệ lớn, thể hiện qua khoảng P05-P95 và giá trị RMSE cực đại.</w:t>
       </w:r>
     </w:p>
     <w:p>
@@ -19748,6 +19760,21 @@
     </w:p>
     <w:p>
       <w:pPr>
+        <w:pStyle w:val="BodyText"/>
+      </w:pPr>
+      <w:r>
+        <w:rPr>
+          <w:b/>
+          <w:bCs/>
+        </w:rPr>
+        <w:t>Giả thiết thống kê:</w:t>
+      </w:r>
+      <w:r>
+        <w:t xml:space="preserve"> Trong phân tích Monte Carlo này, nhiễu Jitter (sai lệch thời gian cạnh xung) và Bounce (dội logic) được giả định là các quá trình ngẫu nhiên độc lập (independent random processes), không có tương quan chéo với nhau."</w:t>
+      </w:r>
+    </w:p>
+    <w:p>
+      <w:pPr>
         <w:pStyle w:val="Heading2"/>
         <w:rPr>
           <w:b/>
@@ -19764,6 +19791,7 @@
           <w:sz w:val="28"/>
           <w:szCs w:val="20"/>
         </w:rPr>
+        <w:lastRenderedPageBreak/>
         <w:t>PHÂN TÍCH MIỀN TẦN SỐ BỔ SUNG</w:t>
       </w:r>
       <w:bookmarkEnd w:id="74"/>
@@ -19773,11 +19801,7 @@
         <w:pStyle w:val="BodyText"/>
       </w:pPr>
       <w:r>
-        <w:t xml:space="preserve">Theo yêu cầu chung của khung đánh giá học phần ("Phải có phân tích miền thời gian và miền tần số khi phù hợp; dùng FFT/PSD đúng cách"), một script bổ sung </w:t>
-      </w:r>
-      <w:r>
-        <w:lastRenderedPageBreak/>
-        <w:t>analyze_frequency_domain.m được xây dựng riêng cho đối tượng cảm biến số (digital), gồm hai nội dung:</w:t>
+        <w:t>Theo yêu cầu chung của khung đánh giá học phần ("Phải có phân tích miền thời gian và miền tần số khi phù hợp; dùng FFT/PSD đúng cách"), một script bổ sung analyze_frequency_domain.m được xây dựng riêng cho đối tượng cảm biến số (digital), gồm hai nội dung:</w:t>
       </w:r>
     </w:p>
     <w:p>
@@ -20166,6 +20190,7 @@
         <w:rPr>
           <w:noProof/>
         </w:rPr>
+        <w:lastRenderedPageBreak/>
         <w:drawing>
           <wp:inline distT="0" distB="0" distL="0" distR="0" wp14:anchorId="25CAE5F8" wp14:editId="45DBC0C3">
             <wp:extent cx="5914113" cy="3284220"/>
@@ -20212,7 +20237,6 @@
         <w:jc w:val="center"/>
       </w:pPr>
       <w:r>
-        <w:lastRenderedPageBreak/>
         <w:t>Hình 4.10 — Phổ FFT kênh A tại ω = 10 rad/s: đỉnh phổ chính khớp lý thuyết (đường đứt nét đỏ), kèm hài bậc 3 đặc trưng của sóng vuông.</w:t>
       </w:r>
     </w:p>
@@ -20243,6 +20267,7 @@
         <w:rPr>
           <w:noProof/>
         </w:rPr>
+        <w:lastRenderedPageBreak/>
         <w:drawing>
           <wp:inline distT="0" distB="0" distL="0" distR="0" wp14:anchorId="07BCB2B3" wp14:editId="073A1513">
             <wp:extent cx="5928360" cy="3292132"/>
@@ -20412,7 +20437,6 @@
         <w:pStyle w:val="Heading3"/>
       </w:pPr>
       <w:r>
-        <w:lastRenderedPageBreak/>
         <w:t>Kiểm chứng bù trừ vị trí bằng Ground Truth</w:t>
       </w:r>
     </w:p>
@@ -20444,6 +20468,7 @@
         <w:pStyle w:val="BodyText"/>
       </w:pPr>
       <w:r>
+        <w:lastRenderedPageBreak/>
         <w:t>Do đó độ phân giải góc trên mỗi count là:</w:t>
       </w:r>
     </w:p>
@@ -20772,7 +20797,6 @@
               <w:jc w:val="center"/>
             </w:pPr>
             <w:r>
-              <w:lastRenderedPageBreak/>
               <w:t>Raw position</w:t>
             </w:r>
           </w:p>
@@ -20952,6 +20976,7 @@
               <w:jc w:val="center"/>
             </w:pPr>
             <w:r>
+              <w:lastRenderedPageBreak/>
               <w:t>Compensated position error</w:t>
             </w:r>
           </w:p>

</xml_diff>